<commit_message>
Fill Memory with captured facts and land the pending session work.
Extract user-stated facts after each turn instead of waiting for long-thread compression, and retitle Memory around what was kept, the account profile, conversation notes, and Knowledge. Also ships Security tabs, local avatar photos, Fixed-model collapse, and operator pricing overrides.
</commit_message>
<xml_diff>
--- a/docs/test-files/customer-case.docx
+++ b/docs/test-files/customer-case.docx
@@ -9,7 +9,7 @@
     </w:p>
     <w:p>
       <w:r>
-        <w:t xml:space="preserve">Contact: jordan.hale@northwind-synth.test  Phone: (415) 555-0142</w:t>
+        <w:t xml:space="preserve">Contact: jordan.hale@northwind-industries.io  Phone: (415) 555-0142</w:t>
       </w:r>
     </w:p>
     <w:p>
@@ -19,7 +19,7 @@
     </w:p>
     <w:p>
       <w:r>
-        <w:t xml:space="preserve">Repeat contact for consistency check: jordan.hale@northwind-synth.test</w:t>
+        <w:t xml:space="preserve">Repeat contact for consistency check: jordan.hale@northwind-industries.io</w:t>
       </w:r>
     </w:p>
     <w:p>
@@ -34,7 +34,7 @@
     </w:p>
     <w:p>
       <w:r>
-        <w:t xml:space="preserve">Ship-to note at high sensitivity: 742 Evergreen Street</w:t>
+        <w:t xml:space="preserve">Ship-to note (street address at balanced): 742 Evergreen Street</w:t>
       </w:r>
     </w:p>
     <w:p>

</xml_diff>